<commit_message>
Polish D1 figure labels and data scaling
</commit_message>
<xml_diff>
--- a/Project 1 Data Quality Assessment/D1 Sensor health/outputs/D1_Sensor_Health_Expert_Report_Auto.docx
+++ b/Project 1 Data Quality Assessment/D1 Sensor health/outputs/D1_Sensor_Health_Expert_Report_Auto.docx
@@ -2765,7 +2765,7 @@
       <w:r>
         <w:drawing>
           <wp:inline xmlns:a="http://schemas.openxmlformats.org/drawingml/2006/main" xmlns:pic="http://schemas.openxmlformats.org/drawingml/2006/picture">
-            <wp:extent cx="5760720" cy="4410276"/>
+            <wp:extent cx="5760720" cy="5405448"/>
             <wp:docPr id="2" name="Picture 2" title="FigV20_adapted_recovery_case.png" descr="Figure V20. Representative adapted recovery after a persistent regime departure, including quality gates, independent residual evidence, and the causal state path."/>
             <wp:cNvGraphicFramePr>
               <a:graphicFrameLocks noChangeAspect="1"/>
@@ -2786,7 +2786,7 @@
                   <pic:spPr>
                     <a:xfrm>
                       <a:off x="0" y="0"/>
-                      <a:ext cx="5760720" cy="4410276"/>
+                      <a:ext cx="5760720" cy="5405448"/>
                     </a:xfrm>
                     <a:prstGeom prst="rect"/>
                   </pic:spPr>

</xml_diff>

<commit_message>
Finalize D1 floor Step calibration and PLS peers
</commit_message>
<xml_diff>
--- a/Project 1 Data Quality Assessment/D1 Sensor health/outputs/D1_Sensor_Health_Expert_Report_Auto.docx
+++ b/Project 1 Data Quality Assessment/D1 Sensor health/outputs/D1_Sensor_Health_Expert_Report_Auto.docx
@@ -70,7 +70,7 @@
           <w:color w:val="202124"/>
           <w:sz w:val="21"/>
         </w:rPr>
-        <w:t>d1-final-2e29da7b7e67</w:t>
+        <w:t>d1-final-57bdbc83894f</w:t>
       </w:r>
     </w:p>
     <w:p>
@@ -114,7 +114,7 @@
           <w:color w:val="202124"/>
           <w:sz w:val="21"/>
         </w:rPr>
-        <w:t>2026-07-17</w:t>
+        <w:t>2026-07-19</w:t>
       </w:r>
     </w:p>
     <w:p>
@@ -1950,7 +1950,7 @@
                 <w:color w:val="202124"/>
                 <w:sz w:val="17"/>
               </w:rPr>
-              <w:t>51</w:t>
+              <w:t>22</w:t>
             </w:r>
           </w:p>
         </w:tc>
@@ -2027,7 +2027,7 @@
                 <w:color w:val="202124"/>
                 <w:sz w:val="17"/>
               </w:rPr>
-              <w:t>44</w:t>
+              <w:t>15</w:t>
             </w:r>
           </w:p>
         </w:tc>
@@ -2335,7 +2335,7 @@
                 <w:color w:val="202124"/>
                 <w:sz w:val="17"/>
               </w:rPr>
-              <w:t>0.9804</w:t>
+              <w:t>0.9545</w:t>
             </w:r>
           </w:p>
         </w:tc>
@@ -2412,7 +2412,7 @@
                 <w:color w:val="202124"/>
                 <w:sz w:val="17"/>
               </w:rPr>
-              <w:t>0.8970-0.9965</w:t>
+              <w:t>0.7820-0.9919</w:t>
             </w:r>
           </w:p>
         </w:tc>
@@ -2566,7 +2566,7 @@
                 <w:color w:val="202124"/>
                 <w:sz w:val="17"/>
               </w:rPr>
-              <w:t>0.22%</w:t>
+              <w:t>0.21%</w:t>
             </w:r>
           </w:p>
         </w:tc>
@@ -2668,7 +2668,7 @@
                 <w:color w:val="202124"/>
                 <w:sz w:val="17"/>
               </w:rPr>
-              <w:t>51 opened = 51 episode records; no duplicate IDs</w:t>
+              <w:t>22 opened = 22 episode records; no duplicate IDs</w:t>
             </w:r>
           </w:p>
         </w:tc>
@@ -3051,7 +3051,7 @@
                 <w:color w:val="202124"/>
                 <w:sz w:val="17"/>
               </w:rPr>
-              <w:t>0.979</w:t>
+              <w:t>0.947</w:t>
             </w:r>
           </w:p>
         </w:tc>
@@ -3076,7 +3076,7 @@
                 <w:color w:val="202124"/>
                 <w:sz w:val="17"/>
               </w:rPr>
-              <w:t>15</w:t>
+              <w:t>14</w:t>
             </w:r>
           </w:p>
         </w:tc>
@@ -3101,7 +3101,7 @@
                 <w:color w:val="202124"/>
                 <w:sz w:val="17"/>
               </w:rPr>
-              <w:t>0.333</w:t>
+              <w:t>0.286</w:t>
             </w:r>
           </w:p>
         </w:tc>
@@ -3126,7 +3126,7 @@
                 <w:color w:val="202124"/>
                 <w:sz w:val="17"/>
               </w:rPr>
-              <w:t>48</w:t>
+              <w:t>19</w:t>
             </w:r>
           </w:p>
         </w:tc>
@@ -3203,7 +3203,7 @@
                 <w:color w:val="202124"/>
                 <w:sz w:val="17"/>
               </w:rPr>
-              <w:t>0.981</w:t>
+              <w:t>0.957</w:t>
             </w:r>
           </w:p>
         </w:tc>
@@ -3228,7 +3228,7 @@
                 <w:color w:val="202124"/>
                 <w:sz w:val="17"/>
               </w:rPr>
-              <w:t>21</w:t>
+              <w:t>26</w:t>
             </w:r>
           </w:p>
         </w:tc>
@@ -3253,7 +3253,7 @@
                 <w:color w:val="202124"/>
                 <w:sz w:val="17"/>
               </w:rPr>
-              <w:t>0.381</w:t>
+              <w:t>0.308</w:t>
             </w:r>
           </w:p>
         </w:tc>
@@ -3278,7 +3278,7 @@
                 <w:color w:val="202124"/>
                 <w:sz w:val="17"/>
               </w:rPr>
-              <w:t>53</w:t>
+              <w:t>23</w:t>
             </w:r>
           </w:p>
         </w:tc>
@@ -3355,7 +3355,7 @@
                 <w:color w:val="202124"/>
                 <w:sz w:val="17"/>
               </w:rPr>
-              <w:t>0.980</w:t>
+              <w:t>0.955</w:t>
             </w:r>
           </w:p>
         </w:tc>
@@ -3380,7 +3380,7 @@
                 <w:color w:val="202124"/>
                 <w:sz w:val="17"/>
               </w:rPr>
-              <w:t>33</w:t>
+              <w:t>39</w:t>
             </w:r>
           </w:p>
         </w:tc>
@@ -3430,7 +3430,7 @@
                 <w:color w:val="202124"/>
                 <w:sz w:val="17"/>
               </w:rPr>
-              <w:t>51</w:t>
+              <w:t>22</w:t>
             </w:r>
           </w:p>
         </w:tc>
@@ -3507,7 +3507,7 @@
                 <w:color w:val="202124"/>
                 <w:sz w:val="17"/>
               </w:rPr>
-              <w:t>0.980</w:t>
+              <w:t>0.955</w:t>
             </w:r>
           </w:p>
         </w:tc>
@@ -3532,7 +3532,7 @@
                 <w:color w:val="202124"/>
                 <w:sz w:val="17"/>
               </w:rPr>
-              <w:t>35</w:t>
+              <w:t>22</w:t>
             </w:r>
           </w:p>
         </w:tc>
@@ -3557,7 +3557,7 @@
                 <w:color w:val="202124"/>
                 <w:sz w:val="17"/>
               </w:rPr>
-              <w:t>0.600</w:t>
+              <w:t>0.636</w:t>
             </w:r>
           </w:p>
         </w:tc>
@@ -3582,7 +3582,7 @@
                 <w:color w:val="202124"/>
                 <w:sz w:val="17"/>
               </w:rPr>
-              <w:t>49</w:t>
+              <w:t>22</w:t>
             </w:r>
           </w:p>
         </w:tc>
@@ -3639,7 +3639,7 @@
           <w:color w:val="202124"/>
           <w:sz w:val="21"/>
         </w:rPr>
-        <w:t>Variant C passed 4/4 challenge classes across 14 channel-scaled templates with a pass rate of 1.00 in every class. Variant D was not selected because it used more candidate attempts and completed fewer natural-data episodes without improving event recovery or controlled challenge outcomes.</w:t>
+        <w:t>Variant C passed 4/4 challenge classes across 14 channel-scaled templates with a pass rate of 1.00 in every class. Variant D was not selected because its longer entry and confirmation windows reduced candidate responsiveness without improving event recovery or controlled challenge outcomes.</w:t>
       </w:r>
     </w:p>
     <w:p>
@@ -3647,13 +3647,504 @@
         <w:pStyle w:val="Heading1"/>
       </w:pPr>
       <w:r>
-        <w:t>7. Mapping and aggregation consistency</w:t>
+        <w:t>7. Detector calibration, routing, and peer selection</w:t>
       </w:r>
     </w:p>
     <w:p>
       <w:r>
-        <w:t>The Step mapping is synchronized across mapping.yaml, the figure generator, and D1_mapping_params.xlsx: logistic k=8.0 and x0=0.40. The final D1 mean is 4.100 versus 4.112 for STRICT V1, a controlled mean change of -0.0115. Conservative caps apply only during causally defined non-normal states.</w:t>
+        <w:t>The Step mapping is synchronized across mapping.yaml, the figure generator, and D1_mapping_params.xlsx: logistic k=16.0 and x0=0.55. The final D1 mean is 4.244 versus 4.252 for STRICT V1. Conservative caps apply only during causally defined non-normal states.</w:t>
       </w:r>
+    </w:p>
+    <w:tbl>
+      <w:tblPr>
+        <w:tblStyle w:val="TableGrid"/>
+        <w:tblW w:type="dxa" w:w="9360"/>
+        <w:jc w:val="left"/>
+        <w:tblLayout w:type="fixed"/>
+        <w:tblLook w:firstColumn="1" w:firstRow="1" w:lastColumn="0" w:lastRow="0" w:noHBand="0" w:noVBand="1" w:val="04A0"/>
+        <w:tblInd w:w="120" w:type="dxa"/>
+      </w:tblPr>
+      <w:tblGrid>
+        <w:gridCol w:w="1900"/>
+        <w:gridCol w:w="3740"/>
+        <w:gridCol w:w="3720"/>
+      </w:tblGrid>
+      <w:tr>
+        <w:trPr>
+          <w:tblHeader w:val="true"/>
+        </w:trPr>
+        <w:tc>
+          <w:tcPr>
+            <w:tcW w:type="dxa" w:w="1900"/>
+            <w:shd w:fill="E8EEF5"/>
+            <w:vAlign w:val="center"/>
+            <w:tcMar>
+              <w:top w:w="80" w:type="dxa"/>
+              <w:start w:w="120" w:type="dxa"/>
+              <w:bottom w:w="80" w:type="dxa"/>
+              <w:end w:w="120" w:type="dxa"/>
+            </w:tcMar>
+          </w:tcPr>
+          <w:p>
+            <w:pPr>
+              <w:spacing w:after="0"/>
+            </w:pPr>
+            <w:r>
+              <w:rPr>
+                <w:rFonts w:ascii="Calibri" w:hAnsi="Calibri" w:eastAsia="Microsoft YaHei"/>
+                <w:b/>
+                <w:color w:val="1F4D78"/>
+                <w:sz w:val="18"/>
+              </w:rPr>
+              <w:t>Component</w:t>
+            </w:r>
+          </w:p>
+        </w:tc>
+        <w:tc>
+          <w:tcPr>
+            <w:tcW w:type="dxa" w:w="3740"/>
+            <w:shd w:fill="E8EEF5"/>
+            <w:vAlign w:val="center"/>
+            <w:tcMar>
+              <w:top w:w="80" w:type="dxa"/>
+              <w:start w:w="120" w:type="dxa"/>
+              <w:bottom w:w="80" w:type="dxa"/>
+              <w:end w:w="120" w:type="dxa"/>
+            </w:tcMar>
+          </w:tcPr>
+          <w:p>
+            <w:pPr>
+              <w:spacing w:after="0"/>
+            </w:pPr>
+            <w:r>
+              <w:rPr>
+                <w:rFonts w:ascii="Calibri" w:hAnsi="Calibri" w:eastAsia="Microsoft YaHei"/>
+                <w:b/>
+                <w:color w:val="1F4D78"/>
+                <w:sz w:val="18"/>
+              </w:rPr>
+              <w:t>Final rule</w:t>
+            </w:r>
+          </w:p>
+        </w:tc>
+        <w:tc>
+          <w:tcPr>
+            <w:tcW w:type="dxa" w:w="3720"/>
+            <w:shd w:fill="E8EEF5"/>
+            <w:vAlign w:val="center"/>
+            <w:tcMar>
+              <w:top w:w="80" w:type="dxa"/>
+              <w:start w:w="120" w:type="dxa"/>
+              <w:bottom w:w="80" w:type="dxa"/>
+              <w:end w:w="120" w:type="dxa"/>
+            </w:tcMar>
+          </w:tcPr>
+          <w:p>
+            <w:pPr>
+              <w:spacing w:after="0"/>
+            </w:pPr>
+            <w:r>
+              <w:rPr>
+                <w:rFonts w:ascii="Calibri" w:hAnsi="Calibri" w:eastAsia="Microsoft YaHei"/>
+                <w:b/>
+                <w:color w:val="1F4D78"/>
+                <w:sz w:val="18"/>
+              </w:rPr>
+              <w:t>Audit evidence</w:t>
+            </w:r>
+          </w:p>
+        </w:tc>
+      </w:tr>
+      <w:tr>
+        <w:tc>
+          <w:tcPr>
+            <w:tcW w:type="dxa" w:w="1900"/>
+            <w:vAlign w:val="center"/>
+            <w:tcMar>
+              <w:top w:w="80" w:type="dxa"/>
+              <w:start w:w="120" w:type="dxa"/>
+              <w:bottom w:w="80" w:type="dxa"/>
+              <w:end w:w="120" w:type="dxa"/>
+            </w:tcMar>
+          </w:tcPr>
+          <w:p>
+            <w:pPr>
+              <w:spacing w:after="0"/>
+            </w:pPr>
+            <w:r>
+              <w:rPr>
+                <w:rFonts w:ascii="Calibri" w:hAnsi="Calibri" w:eastAsia="Microsoft YaHei"/>
+                <w:color w:val="202124"/>
+                <w:sz w:val="17"/>
+              </w:rPr>
+              <w:t>DO_1_4 freeze</w:t>
+            </w:r>
+          </w:p>
+        </w:tc>
+        <w:tc>
+          <w:tcPr>
+            <w:tcW w:type="dxa" w:w="3740"/>
+            <w:vAlign w:val="center"/>
+            <w:tcMar>
+              <w:top w:w="80" w:type="dxa"/>
+              <w:start w:w="120" w:type="dxa"/>
+              <w:bottom w:w="80" w:type="dxa"/>
+              <w:end w:w="120" w:type="dxa"/>
+            </w:tcMar>
+          </w:tcPr>
+          <w:p>
+            <w:pPr>
+              <w:spacing w:after="0"/>
+            </w:pPr>
+            <w:r>
+              <w:rPr>
+                <w:rFonts w:ascii="Calibri" w:hAnsi="Calibri" w:eastAsia="Microsoft YaHei"/>
+                <w:color w:val="202124"/>
+                <w:sz w:val="17"/>
+              </w:rPr>
+              <w:t>Process-floor route; production Q_freeze uses hard RLE only</w:t>
+            </w:r>
+          </w:p>
+        </w:tc>
+        <w:tc>
+          <w:tcPr>
+            <w:tcW w:type="dxa" w:w="3720"/>
+            <w:vAlign w:val="center"/>
+            <w:tcMar>
+              <w:top w:w="80" w:type="dxa"/>
+              <w:start w:w="120" w:type="dxa"/>
+              <w:bottom w:w="80" w:type="dxa"/>
+              <w:end w:w="120" w:type="dxa"/>
+            </w:tcMar>
+          </w:tcPr>
+          <w:p>
+            <w:pPr>
+              <w:spacing w:after="0"/>
+            </w:pPr>
+            <w:r>
+              <w:rPr>
+                <w:rFonts w:ascii="Calibri" w:hAnsi="Calibri" w:eastAsia="Microsoft YaHei"/>
+                <w:color w:val="202124"/>
+                <w:sz w:val="17"/>
+              </w:rPr>
+              <w:t>Low variance and low uniqueness remain diagnostic fields</w:t>
+            </w:r>
+          </w:p>
+        </w:tc>
+      </w:tr>
+      <w:tr>
+        <w:tc>
+          <w:tcPr>
+            <w:tcW w:type="dxa" w:w="1900"/>
+            <w:vAlign w:val="center"/>
+            <w:tcMar>
+              <w:top w:w="80" w:type="dxa"/>
+              <w:start w:w="120" w:type="dxa"/>
+              <w:bottom w:w="80" w:type="dxa"/>
+              <w:end w:w="120" w:type="dxa"/>
+            </w:tcMar>
+          </w:tcPr>
+          <w:p>
+            <w:pPr>
+              <w:spacing w:after="0"/>
+            </w:pPr>
+            <w:r>
+              <w:rPr>
+                <w:rFonts w:ascii="Calibri" w:hAnsi="Calibri" w:eastAsia="Microsoft YaHei"/>
+                <w:color w:val="202124"/>
+                <w:sz w:val="17"/>
+              </w:rPr>
+              <w:t>Step mapping</w:t>
+            </w:r>
+          </w:p>
+        </w:tc>
+        <w:tc>
+          <w:tcPr>
+            <w:tcW w:type="dxa" w:w="3740"/>
+            <w:vAlign w:val="center"/>
+            <w:tcMar>
+              <w:top w:w="80" w:type="dxa"/>
+              <w:start w:w="120" w:type="dxa"/>
+              <w:bottom w:w="80" w:type="dxa"/>
+              <w:end w:w="120" w:type="dxa"/>
+            </w:tcMar>
+          </w:tcPr>
+          <w:p>
+            <w:pPr>
+              <w:spacing w:after="0"/>
+            </w:pPr>
+            <w:r>
+              <w:rPr>
+                <w:rFonts w:ascii="Calibri" w:hAnsi="Calibri" w:eastAsia="Microsoft YaHei"/>
+                <w:color w:val="202124"/>
+                <w:sz w:val="17"/>
+              </w:rPr>
+              <w:t>k=16.0; x0=0.55</w:t>
+            </w:r>
+          </w:p>
+        </w:tc>
+        <w:tc>
+          <w:tcPr>
+            <w:tcW w:type="dxa" w:w="3720"/>
+            <w:vAlign w:val="center"/>
+            <w:tcMar>
+              <w:top w:w="80" w:type="dxa"/>
+              <w:start w:w="120" w:type="dxa"/>
+              <w:bottom w:w="80" w:type="dxa"/>
+              <w:end w:w="120" w:type="dxa"/>
+            </w:tcMar>
+          </w:tcPr>
+          <w:p>
+            <w:pPr>
+              <w:spacing w:after="0"/>
+            </w:pPr>
+            <w:r>
+              <w:rPr>
+                <w:rFonts w:ascii="Calibri" w:hAnsi="Calibri" w:eastAsia="Microsoft YaHei"/>
+                <w:color w:val="202124"/>
+                <w:sz w:val="17"/>
+              </w:rPr>
+              <w:t>10 iid channels; 780 scenarios; detection=0.867</w:t>
+            </w:r>
+          </w:p>
+        </w:tc>
+      </w:tr>
+      <w:tr>
+        <w:tc>
+          <w:tcPr>
+            <w:tcW w:type="dxa" w:w="1900"/>
+            <w:vAlign w:val="center"/>
+            <w:tcMar>
+              <w:top w:w="80" w:type="dxa"/>
+              <w:start w:w="120" w:type="dxa"/>
+              <w:bottom w:w="80" w:type="dxa"/>
+              <w:end w:w="120" w:type="dxa"/>
+            </w:tcMar>
+          </w:tcPr>
+          <w:p>
+            <w:pPr>
+              <w:spacing w:after="0"/>
+            </w:pPr>
+            <w:r>
+              <w:rPr>
+                <w:rFonts w:ascii="Calibri" w:hAnsi="Calibri" w:eastAsia="Microsoft YaHei"/>
+                <w:color w:val="202124"/>
+                <w:sz w:val="17"/>
+              </w:rPr>
+              <w:t>Step applicability</w:t>
+            </w:r>
+          </w:p>
+        </w:tc>
+        <w:tc>
+          <w:tcPr>
+            <w:tcW w:type="dxa" w:w="3740"/>
+            <w:vAlign w:val="center"/>
+            <w:tcMar>
+              <w:top w:w="80" w:type="dxa"/>
+              <w:start w:w="120" w:type="dxa"/>
+              <w:bottom w:w="80" w:type="dxa"/>
+              <w:end w:w="120" w:type="dxa"/>
+            </w:tcMar>
+          </w:tcPr>
+          <w:p>
+            <w:pPr>
+              <w:spacing w:after="0"/>
+            </w:pPr>
+            <w:r>
+              <w:rPr>
+                <w:rFonts w:ascii="Calibri" w:hAnsi="Calibri" w:eastAsia="Microsoft YaHei"/>
+                <w:color w:val="202124"/>
+                <w:sz w:val="17"/>
+              </w:rPr>
+              <w:t>Autocorrelation-aware and floor routes excluded from parameter fit</w:t>
+            </w:r>
+          </w:p>
+        </w:tc>
+        <w:tc>
+          <w:tcPr>
+            <w:tcW w:type="dxa" w:w="3720"/>
+            <w:vAlign w:val="center"/>
+            <w:tcMar>
+              <w:top w:w="80" w:type="dxa"/>
+              <w:start w:w="120" w:type="dxa"/>
+              <w:bottom w:w="80" w:type="dxa"/>
+              <w:end w:w="120" w:type="dxa"/>
+            </w:tcMar>
+          </w:tcPr>
+          <w:p>
+            <w:pPr>
+              <w:spacing w:after="0"/>
+            </w:pPr>
+            <w:r>
+              <w:rPr>
+                <w:rFonts w:ascii="Calibri" w:hAnsi="Calibri" w:eastAsia="Microsoft YaHei"/>
+                <w:color w:val="202124"/>
+                <w:sz w:val="17"/>
+              </w:rPr>
+              <w:t>Theoretical corrected-KS bound retained in the audit</w:t>
+            </w:r>
+          </w:p>
+        </w:tc>
+      </w:tr>
+      <w:tr>
+        <w:tc>
+          <w:tcPr>
+            <w:tcW w:type="dxa" w:w="1900"/>
+            <w:vAlign w:val="center"/>
+            <w:tcMar>
+              <w:top w:w="80" w:type="dxa"/>
+              <w:start w:w="120" w:type="dxa"/>
+              <w:bottom w:w="80" w:type="dxa"/>
+              <w:end w:w="120" w:type="dxa"/>
+            </w:tcMar>
+          </w:tcPr>
+          <w:p>
+            <w:pPr>
+              <w:spacing w:after="0"/>
+            </w:pPr>
+            <w:r>
+              <w:rPr>
+                <w:rFonts w:ascii="Calibri" w:hAnsi="Calibri" w:eastAsia="Microsoft YaHei"/>
+                <w:color w:val="202124"/>
+                <w:sz w:val="17"/>
+              </w:rPr>
+              <w:t>PLS peers</w:t>
+            </w:r>
+          </w:p>
+        </w:tc>
+        <w:tc>
+          <w:tcPr>
+            <w:tcW w:type="dxa" w:w="3740"/>
+            <w:vAlign w:val="center"/>
+            <w:tcMar>
+              <w:top w:w="80" w:type="dxa"/>
+              <w:start w:w="120" w:type="dxa"/>
+              <w:bottom w:w="80" w:type="dxa"/>
+              <w:end w:w="120" w:type="dxa"/>
+            </w:tcMar>
+          </w:tcPr>
+          <w:p>
+            <w:pPr>
+              <w:spacing w:after="0"/>
+            </w:pPr>
+            <w:r>
+              <w:rPr>
+                <w:rFonts w:ascii="Calibri" w:hAnsi="Calibri" w:eastAsia="Microsoft YaHei"/>
+                <w:color w:val="202124"/>
+                <w:sz w:val="17"/>
+              </w:rPr>
+              <w:t>Same-analyte structural core + three-fold blocked temporal CV</w:t>
+            </w:r>
+          </w:p>
+        </w:tc>
+        <w:tc>
+          <w:tcPr>
+            <w:tcW w:type="dxa" w:w="3720"/>
+            <w:vAlign w:val="center"/>
+            <w:tcMar>
+              <w:top w:w="80" w:type="dxa"/>
+              <w:start w:w="120" w:type="dxa"/>
+              <w:bottom w:w="80" w:type="dxa"/>
+              <w:end w:w="120" w:type="dxa"/>
+            </w:tcMar>
+          </w:tcPr>
+          <w:p>
+            <w:pPr>
+              <w:spacing w:after="0"/>
+            </w:pPr>
+            <w:r>
+              <w:rPr>
+                <w:rFonts w:ascii="Calibri" w:hAnsi="Calibri" w:eastAsia="Microsoft YaHei"/>
+                <w:color w:val="202124"/>
+                <w:sz w:val="17"/>
+              </w:rPr>
+              <w:t>No automatic DO-ORP binding; process-floor sensor excluded as predictor</w:t>
+            </w:r>
+          </w:p>
+        </w:tc>
+      </w:tr>
+      <w:tr>
+        <w:tc>
+          <w:tcPr>
+            <w:tcW w:type="dxa" w:w="1900"/>
+            <w:vAlign w:val="center"/>
+            <w:tcMar>
+              <w:top w:w="80" w:type="dxa"/>
+              <w:start w:w="120" w:type="dxa"/>
+              <w:bottom w:w="80" w:type="dxa"/>
+              <w:end w:w="120" w:type="dxa"/>
+            </w:tcMar>
+          </w:tcPr>
+          <w:p>
+            <w:pPr>
+              <w:spacing w:after="0"/>
+            </w:pPr>
+            <w:r>
+              <w:rPr>
+                <w:rFonts w:ascii="Calibri" w:hAnsi="Calibri" w:eastAsia="Microsoft YaHei"/>
+                <w:color w:val="202124"/>
+                <w:sz w:val="17"/>
+              </w:rPr>
+              <w:t>ORP_1_2 platform</w:t>
+            </w:r>
+          </w:p>
+        </w:tc>
+        <w:tc>
+          <w:tcPr>
+            <w:tcW w:type="dxa" w:w="3740"/>
+            <w:vAlign w:val="center"/>
+            <w:tcMar>
+              <w:top w:w="80" w:type="dxa"/>
+              <w:start w:w="120" w:type="dxa"/>
+              <w:bottom w:w="80" w:type="dxa"/>
+              <w:end w:w="120" w:type="dxa"/>
+            </w:tcMar>
+          </w:tcPr>
+          <w:p>
+            <w:pPr>
+              <w:spacing w:after="0"/>
+            </w:pPr>
+            <w:r>
+              <w:rPr>
+                <w:rFonts w:ascii="Calibri" w:hAnsi="Calibri" w:eastAsia="Microsoft YaHei"/>
+                <w:color w:val="202124"/>
+                <w:sz w:val="17"/>
+              </w:rPr>
+              <w:t>State cap retained</w:t>
+            </w:r>
+          </w:p>
+        </w:tc>
+        <w:tc>
+          <w:tcPr>
+            <w:tcW w:type="dxa" w:w="3720"/>
+            <w:vAlign w:val="center"/>
+            <w:tcMar>
+              <w:top w:w="80" w:type="dxa"/>
+              <w:start w:w="120" w:type="dxa"/>
+              <w:bottom w:w="80" w:type="dxa"/>
+              <w:end w:w="120" w:type="dxa"/>
+            </w:tcMar>
+          </w:tcPr>
+          <w:p>
+            <w:pPr>
+              <w:spacing w:after="0"/>
+            </w:pPr>
+            <w:r>
+              <w:rPr>
+                <w:rFonts w:ascii="Calibri" w:hAnsi="Calibri" w:eastAsia="Microsoft YaHei"/>
+                <w:color w:val="202124"/>
+                <w:sz w:val="17"/>
+              </w:rPr>
+              <w:t>Fig. 7 exposes pre-cap score, cap-active hours, and final score</w:t>
+            </w:r>
+          </w:p>
+        </w:tc>
+      </w:tr>
+    </w:tbl>
+    <w:p>
+      <w:pPr>
+        <w:spacing w:after="0"/>
+      </w:pPr>
     </w:p>
     <w:p>
       <w:pPr>
@@ -3664,7 +4155,7 @@
         <w:drawing>
           <wp:inline xmlns:a="http://schemas.openxmlformats.org/drawingml/2006/main" xmlns:pic="http://schemas.openxmlformats.org/drawingml/2006/picture">
             <wp:extent cx="5577840" cy="4326450"/>
-            <wp:docPr id="3" name="Picture 3" title="Fig5_mapping_curves.png" descr="Figure 5. Final D1 mapping functions. The Step panel explicitly reports k=8.0 and x0=0.40."/>
+            <wp:docPr id="3" name="Picture 3" title="Fig5_mapping_curves.png" descr="Figure 5. Final D1 mapping functions. The Step panel reports k=16.0 and x0=0.55."/>
             <wp:cNvGraphicFramePr>
               <a:graphicFrameLocks noChangeAspect="1"/>
             </wp:cNvGraphicFramePr>
@@ -3707,7 +4198,172 @@
           <w:color w:val="5F6368"/>
           <w:sz w:val="18"/>
         </w:rPr>
-        <w:t>Figure 5. Final D1 mapping functions. The Step panel explicitly reports k=8.0 and x0=0.40.</w:t>
+        <w:t>Figure 5. Final D1 mapping functions. The Step panel reports k=16.0 and x0=0.55.</w:t>
+      </w:r>
+    </w:p>
+    <w:p>
+      <w:pPr>
+        <w:spacing w:before="80" w:after="80"/>
+        <w:jc w:val="center"/>
+      </w:pPr>
+      <w:r>
+        <w:drawing>
+          <wp:inline xmlns:a="http://schemas.openxmlformats.org/drawingml/2006/main" xmlns:pic="http://schemas.openxmlformats.org/drawingml/2006/picture">
+            <wp:extent cx="5577840" cy="4337706"/>
+            <wp:docPr id="4" name="Picture 4" title="Fig6_score_loss_attribution.png" descr="Figure 6. Exact pre-cap score-loss attribution and absolute severe-evidence frequency."/>
+            <wp:cNvGraphicFramePr>
+              <a:graphicFrameLocks noChangeAspect="1"/>
+            </wp:cNvGraphicFramePr>
+            <a:graphic>
+              <a:graphicData uri="http://schemas.openxmlformats.org/drawingml/2006/picture">
+                <pic:pic>
+                  <pic:nvPicPr>
+                    <pic:cNvPr id="0" name="Fig6_score_loss_attribution.png"/>
+                    <pic:cNvPicPr/>
+                  </pic:nvPicPr>
+                  <pic:blipFill>
+                    <a:blip r:embed="rId14"/>
+                    <a:stretch>
+                      <a:fillRect/>
+                    </a:stretch>
+                  </pic:blipFill>
+                  <pic:spPr>
+                    <a:xfrm>
+                      <a:off x="0" y="0"/>
+                      <a:ext cx="5577840" cy="4337706"/>
+                    </a:xfrm>
+                    <a:prstGeom prst="rect"/>
+                  </pic:spPr>
+                </pic:pic>
+              </a:graphicData>
+            </a:graphic>
+          </wp:inline>
+        </w:drawing>
+      </w:r>
+    </w:p>
+    <w:p>
+      <w:pPr>
+        <w:spacing w:after="160"/>
+        <w:jc w:val="center"/>
+      </w:pPr>
+      <w:r>
+        <w:rPr>
+          <w:rFonts w:ascii="Calibri" w:hAnsi="Calibri" w:eastAsia="Microsoft YaHei"/>
+          <w:i/>
+          <w:color w:val="5F6368"/>
+          <w:sz w:val="18"/>
+        </w:rPr>
+        <w:t>Figure 6. Exact pre-cap score-loss attribution and absolute severe-evidence frequency.</w:t>
+      </w:r>
+    </w:p>
+    <w:p>
+      <w:pPr>
+        <w:spacing w:before="80" w:after="80"/>
+        <w:jc w:val="center"/>
+      </w:pPr>
+      <w:r>
+        <w:drawing>
+          <wp:inline xmlns:a="http://schemas.openxmlformats.org/drawingml/2006/main" xmlns:pic="http://schemas.openxmlformats.org/drawingml/2006/picture">
+            <wp:extent cx="5577840" cy="3494381"/>
+            <wp:docPr id="5" name="Picture 5" title="Fig9_input_routing_audit.png" descr="Figure 9. Section 1.1-to-D1 input routing, whitening effect, and Step applicability."/>
+            <wp:cNvGraphicFramePr>
+              <a:graphicFrameLocks noChangeAspect="1"/>
+            </wp:cNvGraphicFramePr>
+            <a:graphic>
+              <a:graphicData uri="http://schemas.openxmlformats.org/drawingml/2006/picture">
+                <pic:pic>
+                  <pic:nvPicPr>
+                    <pic:cNvPr id="0" name="Fig9_input_routing_audit.png"/>
+                    <pic:cNvPicPr/>
+                  </pic:nvPicPr>
+                  <pic:blipFill>
+                    <a:blip r:embed="rId15"/>
+                    <a:stretch>
+                      <a:fillRect/>
+                    </a:stretch>
+                  </pic:blipFill>
+                  <pic:spPr>
+                    <a:xfrm>
+                      <a:off x="0" y="0"/>
+                      <a:ext cx="5577840" cy="3494381"/>
+                    </a:xfrm>
+                    <a:prstGeom prst="rect"/>
+                  </pic:spPr>
+                </pic:pic>
+              </a:graphicData>
+            </a:graphic>
+          </wp:inline>
+        </w:drawing>
+      </w:r>
+    </w:p>
+    <w:p>
+      <w:pPr>
+        <w:spacing w:after="160"/>
+        <w:jc w:val="center"/>
+      </w:pPr>
+      <w:r>
+        <w:rPr>
+          <w:rFonts w:ascii="Calibri" w:hAnsi="Calibri" w:eastAsia="Microsoft YaHei"/>
+          <w:i/>
+          <w:color w:val="5F6368"/>
+          <w:sz w:val="18"/>
+        </w:rPr>
+        <w:t>Figure 9. Section 1.1-to-D1 input routing, whitening effect, and Step applicability.</w:t>
+      </w:r>
+    </w:p>
+    <w:p>
+      <w:pPr>
+        <w:spacing w:before="80" w:after="80"/>
+        <w:jc w:val="center"/>
+      </w:pPr>
+      <w:r>
+        <w:drawing>
+          <wp:inline xmlns:a="http://schemas.openxmlformats.org/drawingml/2006/main" xmlns:pic="http://schemas.openxmlformats.org/drawingml/2006/picture">
+            <wp:extent cx="5577840" cy="3551127"/>
+            <wp:docPr id="6" name="Picture 6" title="Fig11_pls_peer_selection.png" descr="Figure 11. Same-analyte PLS peer matrix and blocked-CV predictive gain."/>
+            <wp:cNvGraphicFramePr>
+              <a:graphicFrameLocks noChangeAspect="1"/>
+            </wp:cNvGraphicFramePr>
+            <a:graphic>
+              <a:graphicData uri="http://schemas.openxmlformats.org/drawingml/2006/picture">
+                <pic:pic>
+                  <pic:nvPicPr>
+                    <pic:cNvPr id="0" name="Fig11_pls_peer_selection.png"/>
+                    <pic:cNvPicPr/>
+                  </pic:nvPicPr>
+                  <pic:blipFill>
+                    <a:blip r:embed="rId16"/>
+                    <a:stretch>
+                      <a:fillRect/>
+                    </a:stretch>
+                  </pic:blipFill>
+                  <pic:spPr>
+                    <a:xfrm>
+                      <a:off x="0" y="0"/>
+                      <a:ext cx="5577840" cy="3551127"/>
+                    </a:xfrm>
+                    <a:prstGeom prst="rect"/>
+                  </pic:spPr>
+                </pic:pic>
+              </a:graphicData>
+            </a:graphic>
+          </wp:inline>
+        </w:drawing>
+      </w:r>
+    </w:p>
+    <w:p>
+      <w:pPr>
+        <w:spacing w:after="160"/>
+        <w:jc w:val="center"/>
+      </w:pPr>
+      <w:r>
+        <w:rPr>
+          <w:rFonts w:ascii="Calibri" w:hAnsi="Calibri" w:eastAsia="Microsoft YaHei"/>
+          <w:i/>
+          <w:color w:val="5F6368"/>
+          <w:sz w:val="18"/>
+        </w:rPr>
+        <w:t>Figure 11. Same-analyte PLS peer matrix and blocked-CV predictive gain.</w:t>
       </w:r>
     </w:p>
     <w:p>
@@ -3865,7 +4521,7 @@
                 <w:color w:val="202124"/>
                 <w:sz w:val="17"/>
               </w:rPr>
-              <w:t>7 passed</w:t>
+              <w:t>PASS</w:t>
             </w:r>
           </w:p>
         </w:tc>
@@ -3890,7 +4546,7 @@
                 <w:color w:val="202124"/>
                 <w:sz w:val="17"/>
               </w:rPr>
-              <w:t>Causality, gap handling, event identity, recovery, censoring</w:t>
+              <w:t>Causality, routing, mapping calibration, peer selection, recovery</w:t>
             </w:r>
           </w:p>
         </w:tc>
@@ -4044,7 +4700,7 @@
                 <w:color w:val="202124"/>
                 <w:sz w:val="17"/>
               </w:rPr>
-              <w:t>18 workbooks open; no formula-error tokens</w:t>
+              <w:t>19 workbooks open; no error-cell tokens</w:t>
             </w:r>
           </w:p>
         </w:tc>
@@ -4250,7 +4906,7 @@
                 <w:color w:val="202124"/>
                 <w:sz w:val="17"/>
               </w:rPr>
-              <w:t>d1-final-2e29da7b7e67</w:t>
+              <w:t>d1-final-57bdbc83894f</w:t>
             </w:r>
           </w:p>
         </w:tc>
@@ -4666,6 +5322,58 @@
                 <w:color w:val="202124"/>
                 <w:sz w:val="17"/>
               </w:rPr>
+              <w:t>Step calibration</w:t>
+            </w:r>
+          </w:p>
+        </w:tc>
+        <w:tc>
+          <w:tcPr>
+            <w:tcW w:type="dxa" w:w="7160"/>
+            <w:vAlign w:val="center"/>
+            <w:tcMar>
+              <w:top w:w="80" w:type="dxa"/>
+              <w:start w:w="120" w:type="dxa"/>
+              <w:bottom w:w="80" w:type="dxa"/>
+              <w:end w:w="120" w:type="dxa"/>
+            </w:tcMar>
+          </w:tcPr>
+          <w:p>
+            <w:pPr>
+              <w:spacing w:after="0"/>
+            </w:pPr>
+            <w:r>
+              <w:rPr>
+                <w:rFonts w:ascii="Calibri" w:hAnsi="Calibri" w:eastAsia="Microsoft YaHei"/>
+                <w:color w:val="202124"/>
+                <w:sz w:val="17"/>
+              </w:rPr>
+              <w:t>outputs/data/D1_step_mapping_calibration.xlsx</w:t>
+            </w:r>
+          </w:p>
+        </w:tc>
+      </w:tr>
+      <w:tr>
+        <w:tc>
+          <w:tcPr>
+            <w:tcW w:type="dxa" w:w="2200"/>
+            <w:vAlign w:val="center"/>
+            <w:tcMar>
+              <w:top w:w="80" w:type="dxa"/>
+              <w:start w:w="120" w:type="dxa"/>
+              <w:bottom w:w="80" w:type="dxa"/>
+              <w:end w:w="120" w:type="dxa"/>
+            </w:tcMar>
+          </w:tcPr>
+          <w:p>
+            <w:pPr>
+              <w:spacing w:after="0"/>
+            </w:pPr>
+            <w:r>
+              <w:rPr>
+                <w:rFonts w:ascii="Calibri" w:hAnsi="Calibri" w:eastAsia="Microsoft YaHei"/>
+                <w:color w:val="202124"/>
+                <w:sz w:val="17"/>
+              </w:rPr>
               <w:t>Figure source data</w:t>
             </w:r>
           </w:p>

</xml_diff>

<commit_message>
Fix D1 topology-constrained PLS peers
</commit_message>
<xml_diff>
--- a/Project 1 Data Quality Assessment/D1 Sensor health/outputs/D1_Sensor_Health_Expert_Report_Auto.docx
+++ b/Project 1 Data Quality Assessment/D1 Sensor health/outputs/D1_Sensor_Health_Expert_Report_Auto.docx
@@ -70,7 +70,7 @@
           <w:color w:val="202124"/>
           <w:sz w:val="21"/>
         </w:rPr>
-        <w:t>d1-final-57bdbc83894f</w:t>
+        <w:t>d1-final-ab36d51d4f60</w:t>
       </w:r>
     </w:p>
     <w:p>
@@ -114,7 +114,7 @@
           <w:color w:val="202124"/>
           <w:sz w:val="21"/>
         </w:rPr>
-        <w:t>2026-07-19</w:t>
+        <w:t>2026-07-21</w:t>
       </w:r>
     </w:p>
     <w:p>
@@ -3652,7 +3652,7 @@
     </w:p>
     <w:p>
       <w:r>
-        <w:t>The Step mapping is synchronized across mapping.yaml, the figure generator, and D1_mapping_params.xlsx: logistic k=16.0 and x0=0.55. The final D1 mean is 4.244 versus 4.252 for STRICT V1. Conservative caps apply only during causally defined non-normal states.</w:t>
+        <w:t>The Step mapping is synchronized across mapping.yaml, the figure generator, and D1_mapping_params.xlsx: logistic k=16.0 and x0=0.55. The final D1 mean is 4.241 versus 4.250 for STRICT V1. Conservative caps apply only during causally defined non-normal states.</w:t>
       </w:r>
     </w:p>
     <w:tbl>
@@ -4033,7 +4033,7 @@
                 <w:color w:val="202124"/>
                 <w:sz w:val="17"/>
               </w:rPr>
-              <w:t>Same-analyte structural core + three-fold blocked temporal CV</w:t>
+              <w:t>Adjacent/twin topology core; same-pool second-order CV expansion only</w:t>
             </w:r>
           </w:p>
         </w:tc>
@@ -4058,7 +4058,7 @@
                 <w:color w:val="202124"/>
                 <w:sz w:val="17"/>
               </w:rPr>
-              <w:t>No automatic DO-ORP binding; process-floor sensor excluded as predictor</w:t>
+              <w:t>DO_2_4: DO_2_3 -&gt; DO_2_3;DO_2_2; median gain=12.81%; p90 change=+1.87%</w:t>
             </w:r>
           </w:p>
         </w:tc>
@@ -4145,6 +4145,11 @@
       <w:pPr>
         <w:spacing w:after="0"/>
       </w:pPr>
+    </w:p>
+    <w:p>
+      <w:r>
+        <w:t>The PLS selector preserves a valid one-peer topology core and reports limited redundancy explicitly. It does not fill sparse peer sets by lexical order or with distant/cross-train channels. This removes the previous unsupported DO_2_4 links to DO_1_1 and DO_1_2; DO_2_3 is the structural core and DO_2_2 is the only blocked-CV-supported expansion.</w:t>
+      </w:r>
     </w:p>
     <w:p>
       <w:pPr>
@@ -4319,8 +4324,8 @@
       <w:r>
         <w:drawing>
           <wp:inline xmlns:a="http://schemas.openxmlformats.org/drawingml/2006/main" xmlns:pic="http://schemas.openxmlformats.org/drawingml/2006/picture">
-            <wp:extent cx="5577840" cy="3551127"/>
-            <wp:docPr id="6" name="Picture 6" title="Fig11_pls_peer_selection.png" descr="Figure 11. Same-analyte PLS peer matrix and blocked-CV predictive gain."/>
+            <wp:extent cx="5577840" cy="3255970"/>
+            <wp:docPr id="6" name="Picture 6" title="Fig11_pls_peer_selection.png" descr="Figure 11. Topology-approved PLS peer matrix and blocked-CV gain. Blue cells are adjacent/twin core peers; amber cells are CV-added same-pool second-order peers."/>
             <wp:cNvGraphicFramePr>
               <a:graphicFrameLocks noChangeAspect="1"/>
             </wp:cNvGraphicFramePr>
@@ -4340,7 +4345,7 @@
                   <pic:spPr>
                     <a:xfrm>
                       <a:off x="0" y="0"/>
-                      <a:ext cx="5577840" cy="3551127"/>
+                      <a:ext cx="5577840" cy="3255970"/>
                     </a:xfrm>
                     <a:prstGeom prst="rect"/>
                   </pic:spPr>
@@ -4363,7 +4368,7 @@
           <w:color w:val="5F6368"/>
           <w:sz w:val="18"/>
         </w:rPr>
-        <w:t>Figure 11. Same-analyte PLS peer matrix and blocked-CV predictive gain.</w:t>
+        <w:t>Figure 11. Topology-approved PLS peer matrix and blocked-CV gain. Blue cells are adjacent/twin core peers; amber cells are CV-added same-pool second-order peers.</w:t>
       </w:r>
     </w:p>
     <w:p>
@@ -4906,7 +4911,7 @@
                 <w:color w:val="202124"/>
                 <w:sz w:val="17"/>
               </w:rPr>
-              <w:t>d1-final-57bdbc83894f</w:t>
+              <w:t>d1-final-ab36d51d4f60</w:t>
             </w:r>
           </w:p>
         </w:tc>

</xml_diff>

<commit_message>
Validate D1 DO2_4 PLS peer admission
</commit_message>
<xml_diff>
--- a/Project 1 Data Quality Assessment/D1 Sensor health/outputs/D1_Sensor_Health_Expert_Report_Auto.docx
+++ b/Project 1 Data Quality Assessment/D1 Sensor health/outputs/D1_Sensor_Health_Expert_Report_Auto.docx
@@ -70,7 +70,7 @@
           <w:color w:val="202124"/>
           <w:sz w:val="21"/>
         </w:rPr>
-        <w:t>d1-final-ab36d51d4f60</w:t>
+        <w:t>d1-final-8fdd3599890f</w:t>
       </w:r>
     </w:p>
     <w:p>
@@ -3652,7 +3652,7 @@
     </w:p>
     <w:p>
       <w:r>
-        <w:t>The Step mapping is synchronized across mapping.yaml, the figure generator, and D1_mapping_params.xlsx: logistic k=16.0 and x0=0.55. The final D1 mean is 4.241 versus 4.250 for STRICT V1. Conservative caps apply only during causally defined non-normal states.</w:t>
+        <w:t>The Step mapping is synchronized across mapping.yaml, the figure generator, and D1_mapping_params.xlsx: logistic k=16.0 and x0=0.55. The final D1 mean is 4.245 versus 4.254 for STRICT V1. Conservative caps apply only during causally defined non-normal states.</w:t>
       </w:r>
     </w:p>
     <w:tbl>
@@ -4033,7 +4033,7 @@
                 <w:color w:val="202124"/>
                 <w:sz w:val="17"/>
               </w:rPr>
-              <w:t>Adjacent/twin topology core; same-pool second-order CV expansion only</w:t>
+              <w:t>Forward blocks + block bootstrap + terminal test + four injection classes</w:t>
             </w:r>
           </w:p>
         </w:tc>
@@ -4058,7 +4058,7 @@
                 <w:color w:val="202124"/>
                 <w:sz w:val="17"/>
               </w:rPr>
-              <w:t>DO_2_4: DO_2_3 -&gt; DO_2_3;DO_2_2; median gain=12.81%; p90 change=+1.87%</w:t>
+              <w:t>DO_2_4 retains DO_2_3 (1 component); M1,1 median gain=-5.35% (95% CI -16.65% to 0.51%); terminal gain=-19.43%</w:t>
             </w:r>
           </w:p>
         </w:tc>
@@ -4148,7 +4148,7 @@
     </w:p>
     <w:p>
       <w:r>
-        <w:t>The PLS selector preserves a valid one-peer topology core and reports limited redundancy explicitly. It does not fill sparse peer sets by lexical order or with distant/cross-train channels. This removes the previous unsupported DO_2_4 links to DO_1_1 and DO_1_2; DO_2_3 is the structural core and DO_2_2 is the only blocked-CV-supported expansion.</w:t>
+        <w:t>The PLS selector preserves a valid one-peer topology core and reports limited redundancy explicitly. It does not fill sparse peer sets by lexical order or with distant/cross-train channels. This removes the previous unsupported DO_2_4 links to DO_1_1 and DO_1_2. DO_2_3 is the structural core; DO_2_2 was evaluated as the only defensible second-order candidate but was not admitted. The one-component candidate had development and terminal-test gains of -5.35% and -19.43%, respectively; the two-component candidate was still weaker (-19.50% development gain). The formal decision is core_retained.</w:t>
       </w:r>
     </w:p>
     <w:p>
@@ -4324,8 +4324,8 @@
       <w:r>
         <w:drawing>
           <wp:inline xmlns:a="http://schemas.openxmlformats.org/drawingml/2006/main" xmlns:pic="http://schemas.openxmlformats.org/drawingml/2006/picture">
-            <wp:extent cx="5577840" cy="3255970"/>
-            <wp:docPr id="6" name="Picture 6" title="Fig11_pls_peer_selection.png" descr="Figure 11. Topology-approved PLS peer matrix and blocked-CV gain. Blue cells are adjacent/twin core peers; amber cells are CV-added same-pool second-order peers."/>
+            <wp:extent cx="5577840" cy="3971328"/>
+            <wp:docPr id="6" name="Picture 6" title="Fig11_pls_peer_selection.png" descr="Figure 11. DO_2_4 PLS peer-admission evidence. Panels report forward-block gains, median and 95% moving-block-bootstrap intervals, positive-gain fractions, P90 tail error, terminal 42-day hold-out results, and controlled target/peer/common-process injections. The topology core M0 is retained."/>
             <wp:cNvGraphicFramePr>
               <a:graphicFrameLocks noChangeAspect="1"/>
             </wp:cNvGraphicFramePr>
@@ -4345,7 +4345,7 @@
                   <pic:spPr>
                     <a:xfrm>
                       <a:off x="0" y="0"/>
-                      <a:ext cx="5577840" cy="3255970"/>
+                      <a:ext cx="5577840" cy="3971328"/>
                     </a:xfrm>
                     <a:prstGeom prst="rect"/>
                   </pic:spPr>
@@ -4368,7 +4368,7 @@
           <w:color w:val="5F6368"/>
           <w:sz w:val="18"/>
         </w:rPr>
-        <w:t>Figure 11. Topology-approved PLS peer matrix and blocked-CV gain. Blue cells are adjacent/twin core peers; amber cells are CV-added same-pool second-order peers.</w:t>
+        <w:t>Figure 11. DO_2_4 PLS peer-admission evidence. Panels report forward-block gains, median and 95% moving-block-bootstrap intervals, positive-gain fractions, P90 tail error, terminal 42-day hold-out results, and controlled target/peer/common-process injections. The topology core M0 is retained.</w:t>
       </w:r>
     </w:p>
     <w:p>
@@ -4705,7 +4705,7 @@
                 <w:color w:val="202124"/>
                 <w:sz w:val="17"/>
               </w:rPr>
-              <w:t>19 workbooks open; no error-cell tokens</w:t>
+              <w:t>18 core / 20 total workbooks open; no error-cell tokens</w:t>
             </w:r>
           </w:p>
         </w:tc>
@@ -4911,7 +4911,7 @@
                 <w:color w:val="202124"/>
                 <w:sz w:val="17"/>
               </w:rPr>
-              <w:t>d1-final-ab36d51d4f60</w:t>
+              <w:t>d1-final-8fdd3599890f</w:t>
             </w:r>
           </w:p>
         </w:tc>

</xml_diff>

<commit_message>
Add D1 formal PLS peer topology figure
</commit_message>
<xml_diff>
--- a/Project 1 Data Quality Assessment/D1 Sensor health/outputs/D1_Sensor_Health_Expert_Report_Auto.docx
+++ b/Project 1 Data Quality Assessment/D1 Sensor health/outputs/D1_Sensor_Health_Expert_Report_Auto.docx
@@ -4373,6 +4373,61 @@
     </w:p>
     <w:p>
       <w:pPr>
+        <w:spacing w:before="80" w:after="80"/>
+        <w:jc w:val="center"/>
+      </w:pPr>
+      <w:r>
+        <w:drawing>
+          <wp:inline xmlns:a="http://schemas.openxmlformats.org/drawingml/2006/main" xmlns:pic="http://schemas.openxmlformats.org/drawingml/2006/picture">
+            <wp:extent cx="5577840" cy="4128511"/>
+            <wp:docPr id="7" name="Picture 7" title="FigS1_pls_formal_peer_topology.png" descr="Supplementary Figure S1. Production-active PLS peer topology for all 14 scored channels. Rows are targets and columns are formal predictors; the adjacent table reports effective peer and component counts. Rejected candidates are omitted. DO_2_4 has the full forward/hold-out/injection audit; remaining targets retain topology-constrained three-fold blocked-CV evidence."/>
+            <wp:cNvGraphicFramePr>
+              <a:graphicFrameLocks noChangeAspect="1"/>
+            </wp:cNvGraphicFramePr>
+            <a:graphic>
+              <a:graphicData uri="http://schemas.openxmlformats.org/drawingml/2006/picture">
+                <pic:pic>
+                  <pic:nvPicPr>
+                    <pic:cNvPr id="0" name="FigS1_pls_formal_peer_topology.png"/>
+                    <pic:cNvPicPr/>
+                  </pic:nvPicPr>
+                  <pic:blipFill>
+                    <a:blip r:embed="rId17"/>
+                    <a:stretch>
+                      <a:fillRect/>
+                    </a:stretch>
+                  </pic:blipFill>
+                  <pic:spPr>
+                    <a:xfrm>
+                      <a:off x="0" y="0"/>
+                      <a:ext cx="5577840" cy="4128511"/>
+                    </a:xfrm>
+                    <a:prstGeom prst="rect"/>
+                  </pic:spPr>
+                </pic:pic>
+              </a:graphicData>
+            </a:graphic>
+          </wp:inline>
+        </w:drawing>
+      </w:r>
+    </w:p>
+    <w:p>
+      <w:pPr>
+        <w:spacing w:after="160"/>
+        <w:jc w:val="center"/>
+      </w:pPr>
+      <w:r>
+        <w:rPr>
+          <w:rFonts w:ascii="Calibri" w:hAnsi="Calibri" w:eastAsia="Microsoft YaHei"/>
+          <w:i/>
+          <w:color w:val="5F6368"/>
+          <w:sz w:val="18"/>
+        </w:rPr>
+        <w:t>Supplementary Figure S1. Production-active PLS peer topology for all 14 scored channels. Rows are targets and columns are formal predictors; the adjacent table reports effective peer and component counts. Rejected candidates are omitted. DO_2_4 has the full forward/hold-out/injection audit; remaining targets retain topology-constrained three-fold blocked-CV evidence.</w:t>
+      </w:r>
+    </w:p>
+    <w:p>
+      <w:pPr>
         <w:pStyle w:val="Heading1"/>
       </w:pPr>
       <w:r>
@@ -4757,7 +4812,7 @@
                 <w:color w:val="202124"/>
                 <w:sz w:val="17"/>
               </w:rPr>
-              <w:t>20/20</w:t>
+              <w:t>21/21</w:t>
             </w:r>
           </w:p>
         </w:tc>

</xml_diff>